<commit_message>
Plantworks Studio: new identity, title-block lockup and P mark; favicon, nav, footer, share image and document templates updated
Co-Authored-By: Claude Fable 5.1 <noreply@anthropic.com>
Claude-Session: https://claude.ai/code/session_01JNXA7Uz8qiMYfqnYN9MWx9
</commit_message>
<xml_diff>
--- a/plantworks-studio/templates/Plantworks-Factura-ES.docx
+++ b/plantworks-studio/templates/Plantworks-Factura-ES.docx
@@ -40,31 +40,44 @@
               <w:spacing w:after="0"/>
             </w:pPr>
             <w:r>
-              <w:rPr>
-                <w:rFonts w:ascii="Georgia" w:cs="Georgia" w:eastAsia="Georgia" w:hAnsi="Georgia"/>
-                <w:b/>
-                <w:bCs/>
-                <w:color w:val="1B2A38"/>
-                <w:sz w:val="36"/>
-                <w:szCs w:val="36"/>
-              </w:rPr>
-              <w:t xml:space="preserve">Plantworks</w:t>
-            </w:r>
-          </w:p>
-          <w:p>
-            <w:pPr>
-              <w:spacing w:after="0"/>
-            </w:pPr>
-            <w:r>
-              <w:rPr>
-                <w:rFonts w:ascii="Calibri" w:cs="Calibri" w:eastAsia="Calibri" w:hAnsi="Calibri"/>
-                <w:b/>
-                <w:bCs/>
-                <w:color w:val="E0762E"/>
-                <w:sz w:val="15"/>
-                <w:szCs w:val="15"/>
-              </w:rPr>
-              <w:t xml:space="preserve">STUDIO · COSTA DEL SOL &amp; REINO UNIDO</w:t>
+              <w:drawing>
+                <wp:inline distT="0" distB="0" distL="0" distR="0">
+                  <wp:extent cx="2857500" cy="847725"/>
+                  <wp:effectExtent t="0" r="0" b="0" l="0"/>
+                  <wp:docPr id="1" name="" descr="" title=""/>
+                  <wp:cNvGraphicFramePr>
+                    <a:graphicFrameLocks xmlns:a="http://schemas.openxmlformats.org/drawingml/2006/main" noChangeAspect="1"/>
+                  </wp:cNvGraphicFramePr>
+                  <a:graphic xmlns:a="http://schemas.openxmlformats.org/drawingml/2006/main">
+                    <a:graphicData uri="http://schemas.openxmlformats.org/drawingml/2006/picture">
+                      <pic:pic xmlns:pic="http://schemas.openxmlformats.org/drawingml/2006/picture">
+                        <pic:nvPicPr>
+                          <pic:cNvPr id="0" name="" descr=""/>
+                          <pic:cNvPicPr>
+                            <a:picLocks noChangeAspect="1" noChangeArrowheads="1"/>
+                          </pic:cNvPicPr>
+                        </pic:nvPicPr>
+                        <pic:blipFill>
+                          <a:blip r:embed="rId7" cstate="none"/>
+                          <a:srcRect/>
+                          <a:stretch>
+                            <a:fillRect/>
+                          </a:stretch>
+                        </pic:blipFill>
+                        <pic:spPr bwMode="auto">
+                          <a:xfrm>
+                            <a:off x="0" y="0"/>
+                            <a:ext cx="2857500" cy="847725"/>
+                          </a:xfrm>
+                          <a:prstGeom prst="rect">
+                            <a:avLst/>
+                          </a:prstGeom>
+                        </pic:spPr>
+                      </pic:pic>
+                    </a:graphicData>
+                  </a:graphic>
+                </wp:inline>
+              </w:drawing>
             </w:r>
           </w:p>
         </w:tc>

</xml_diff>